<commit_message>
updated proj file (CL version 6.0.1) and user guide
</commit_message>
<xml_diff>
--- a/docs/LANDIS-II Climate Library v5.0 User Guide.docx
+++ b/docs/LANDIS-II Climate Library v5.0 User Guide.docx
@@ -160,7 +160,7 @@
         <w:rPr>
           <w:noProof/>
         </w:rPr>
-        <w:t>July 15, 2026</w:t>
+        <w:t>August 4, 2026</w:t>
       </w:r>
       <w:r>
         <w:rPr>
@@ -3863,15 +3863,7 @@
         <w:t xml:space="preserve"> and DGS</w:t>
       </w:r>
       <w:r>
-        <w:t xml:space="preserve"> or the ecoregion in </w:t>
-      </w:r>
-      <w:proofErr w:type="spellStart"/>
-      <w:r>
-        <w:t>PnET</w:t>
-      </w:r>
-      <w:proofErr w:type="spellEnd"/>
-      <w:r>
-        <w:t xml:space="preserve"> succession) </w:t>
+        <w:t xml:space="preserve"> or the ecoregion in PnET succession) </w:t>
       </w:r>
       <w:r>
         <w:t xml:space="preserve">and then delivered to LANDIS-II as either monthly or daily for the requested time period in a common format (comma delimited with a header).  These data will be read into a new climate library (a sharable body of code) that will perform all necessary pre-processing for all climate-dependent LANDIS-II extensions.  </w:t>
@@ -3942,15 +3934,7 @@
         <w:t xml:space="preserve">, </w:t>
       </w:r>
       <w:r>
-        <w:t xml:space="preserve">DGS, </w:t>
-      </w:r>
-      <w:proofErr w:type="spellStart"/>
-      <w:r>
-        <w:t>PnET</w:t>
-      </w:r>
-      <w:proofErr w:type="spellEnd"/>
-      <w:r>
-        <w:t xml:space="preserve">, and </w:t>
+        <w:t xml:space="preserve">DGS, PnET, and </w:t>
       </w:r>
       <w:r>
         <w:t xml:space="preserve">Biomass </w:t>
@@ -3979,15 +3963,7 @@
         <w:t xml:space="preserve"> controls the loading of</w:t>
       </w:r>
       <w:r>
-        <w:t xml:space="preserve"> the climate data.  It is similar to the scenario file in that it is the master climate file that specifies which options and which files to use.  In the example below, the keyword </w:t>
-      </w:r>
-      <w:proofErr w:type="spellStart"/>
-      <w:r>
-        <w:t>ClimateConfigFile</w:t>
-      </w:r>
-      <w:proofErr w:type="spellEnd"/>
-      <w:r>
-        <w:t xml:space="preserve"> </w:t>
+        <w:t xml:space="preserve"> the climate data.  It is similar to the scenario file in that it is the master climate file that specifies which options and which files to use.  In the example below, the keyword ClimateConfigFile </w:t>
       </w:r>
       <w:r>
         <w:t xml:space="preserve">in the succession input file </w:t>
@@ -4357,47 +4333,7 @@
         <w:t xml:space="preserve">Added PET as an optional input variable. </w:t>
       </w:r>
       <w:r>
-        <w:t xml:space="preserve">Added </w:t>
-      </w:r>
-      <w:proofErr w:type="spellStart"/>
-      <w:r>
-        <w:t>FineFuelMoistureCode</w:t>
-      </w:r>
-      <w:proofErr w:type="spellEnd"/>
-      <w:r>
-        <w:t xml:space="preserve">, </w:t>
-      </w:r>
-      <w:proofErr w:type="spellStart"/>
-      <w:r>
-        <w:t>DuffMoistureCode</w:t>
-      </w:r>
-      <w:proofErr w:type="spellEnd"/>
-      <w:r>
-        <w:t xml:space="preserve"> and </w:t>
-      </w:r>
-      <w:proofErr w:type="spellStart"/>
-      <w:r>
-        <w:t>DroughtCode</w:t>
-      </w:r>
-      <w:proofErr w:type="spellEnd"/>
-      <w:r>
-        <w:t xml:space="preserve"> as optional parameters input parameters rather than hard coded in </w:t>
-      </w:r>
-      <w:proofErr w:type="spellStart"/>
-      <w:r>
-        <w:t>FireClimate.cs</w:t>
-      </w:r>
-      <w:proofErr w:type="spellEnd"/>
-      <w:r>
-        <w:t xml:space="preserve">. Fixed bug that caused an error in Monthly PET calculations and bug that didn’t allow </w:t>
-      </w:r>
-      <w:proofErr w:type="spellStart"/>
-      <w:r>
-        <w:t>BeginGrow</w:t>
-      </w:r>
-      <w:proofErr w:type="spellEnd"/>
-      <w:r>
-        <w:t xml:space="preserve"> to be calculated properly if daily data was used. The period to allow the growing season start date to be calculated was extended later in the season to account for our work in boreal ecosystems.</w:t>
+        <w:t>Added FineFuelMoistureCode, DuffMoistureCode and DroughtCode as optional parameters input parameters rather than hard coded in FireClimate.cs. Fixed bug that caused an error in Monthly PET calculations and bug that didn’t allow BeginGrow to be calculated properly if daily data was used. The period to allow the growing season start date to be calculated was extended later in the season to account for our work in boreal ecosystems.</w:t>
       </w:r>
     </w:p>
     <w:p>
@@ -4437,10 +4373,17 @@
         <w:t xml:space="preserve"> calculated from specific humidity and average temperature. </w:t>
       </w:r>
       <w:r>
-        <w:t>Changed units of SH to be kg/kg rather than g/kg</w:t>
+        <w:t xml:space="preserve">Changed units of SH to be kg/kg rather than </w:t>
+      </w:r>
+      <w:r>
+        <w:lastRenderedPageBreak/>
+        <w:t>g/kg</w:t>
       </w:r>
       <w:r>
         <w:t>.</w:t>
+      </w:r>
+      <w:r>
+        <w:t xml:space="preserve"> Note: SH values of zero result in NaN values for dewpoint, which can trigger an error. </w:t>
       </w:r>
     </w:p>
     <w:p>
@@ -4578,13 +4521,11 @@
       </w:pPr>
       <w:bookmarkStart w:id="15" w:name="_Toc112490865"/>
       <w:bookmarkStart w:id="16" w:name="_Toc173946525"/>
-      <w:proofErr w:type="spellStart"/>
       <w:r>
         <w:t>LandisData</w:t>
       </w:r>
       <w:bookmarkEnd w:id="15"/>
       <w:bookmarkEnd w:id="16"/>
-      <w:proofErr w:type="spellEnd"/>
     </w:p>
     <w:p>
       <w:pPr>
@@ -4616,13 +4557,8 @@
         <w:ind w:left="1170" w:hanging="1170"/>
       </w:pPr>
       <w:bookmarkStart w:id="17" w:name="_Toc173946526"/>
-      <w:proofErr w:type="spellStart"/>
-      <w:r>
-        <w:t>ClimateTimeSeries</w:t>
-      </w:r>
-      <w:proofErr w:type="spellEnd"/>
-      <w:r>
-        <w:t xml:space="preserve"> (Future</w:t>
+      <w:r>
+        <w:t>ClimateTimeSeries (Future</w:t>
       </w:r>
       <w:r>
         <w:t xml:space="preserve"> c</w:t>
@@ -4684,30 +4620,13 @@
         <w:t>six</w:t>
       </w:r>
       <w:r>
-        <w:t xml:space="preserve"> valid values for the </w:t>
-      </w:r>
-      <w:proofErr w:type="spellStart"/>
-      <w:r>
-        <w:t>ClimateTimeSeries</w:t>
-      </w:r>
-      <w:proofErr w:type="spellEnd"/>
-      <w:r>
-        <w:t xml:space="preserve"> input parameter: </w:t>
-      </w:r>
-      <w:proofErr w:type="spellStart"/>
+        <w:t xml:space="preserve"> valid values for the ClimateTimeSeries input parameter: </w:t>
+      </w:r>
       <w:r>
         <w:t>Mo</w:t>
       </w:r>
       <w:r>
-        <w:t>nthly_AverageAllYears</w:t>
-      </w:r>
-      <w:proofErr w:type="spellEnd"/>
-      <w:r>
-        <w:t xml:space="preserve">, </w:t>
-      </w:r>
-      <w:proofErr w:type="spellStart"/>
-      <w:r>
-        <w:t>Monthly_</w:t>
+        <w:t>nthly_AverageAllYears, Monthly_</w:t>
       </w:r>
       <w:r>
         <w:t>RandomYear</w:t>
@@ -4715,48 +4634,24 @@
       <w:r>
         <w:t>s</w:t>
       </w:r>
-      <w:proofErr w:type="spellEnd"/>
-      <w:r>
-        <w:t xml:space="preserve">, </w:t>
-      </w:r>
-      <w:proofErr w:type="spellStart"/>
-      <w:r>
-        <w:t>Monthly_Sequ</w:t>
-      </w:r>
-      <w:r>
-        <w:t>encedYears</w:t>
-      </w:r>
-      <w:proofErr w:type="spellEnd"/>
-      <w:r>
-        <w:t xml:space="preserve">, </w:t>
-      </w:r>
-      <w:proofErr w:type="spellStart"/>
-      <w:r>
-        <w:t>Daily_AverageAllYears</w:t>
-      </w:r>
-      <w:proofErr w:type="spellEnd"/>
-      <w:r>
-        <w:t xml:space="preserve">, </w:t>
-      </w:r>
-      <w:proofErr w:type="spellStart"/>
-      <w:r>
-        <w:t>Daily_RandomYear</w:t>
+      <w:r>
+        <w:t>, Monthly_Sequ</w:t>
+      </w:r>
+      <w:r>
+        <w:t xml:space="preserve">encedYears, </w:t>
+      </w:r>
+      <w:r>
+        <w:t>Daily_AverageAllYears, Daily_RandomYear</w:t>
       </w:r>
       <w:r>
         <w:t>s</w:t>
       </w:r>
-      <w:proofErr w:type="spellEnd"/>
       <w:r>
         <w:t>,</w:t>
       </w:r>
       <w:r>
-        <w:t xml:space="preserve"> and </w:t>
-      </w:r>
-      <w:proofErr w:type="spellStart"/>
-      <w:r>
-        <w:t>Daily_SequencedYears</w:t>
-      </w:r>
-      <w:proofErr w:type="spellEnd"/>
+        <w:t xml:space="preserve"> and Daily_SequencedYears</w:t>
+      </w:r>
       <w:r>
         <w:t>.  Each one is described below.</w:t>
       </w:r>
@@ -4770,12 +4665,10 @@
         <w:ind w:hanging="2250"/>
       </w:pPr>
       <w:bookmarkStart w:id="18" w:name="_Toc173946527"/>
-      <w:proofErr w:type="spellStart"/>
       <w:r>
         <w:t>Monthly_AverageAllYears</w:t>
       </w:r>
       <w:bookmarkEnd w:id="18"/>
-      <w:proofErr w:type="spellEnd"/>
     </w:p>
     <w:p>
       <w:pPr>
@@ -4785,15 +4678,7 @@
         </w:rPr>
       </w:pPr>
       <w:r>
-        <w:t>If the ‘</w:t>
-      </w:r>
-      <w:proofErr w:type="spellStart"/>
-      <w:r>
-        <w:t>Monthly_AverageAllYears</w:t>
-      </w:r>
-      <w:proofErr w:type="spellEnd"/>
-      <w:r>
-        <w:t xml:space="preserve">’ option is used, </w:t>
+        <w:t xml:space="preserve">If the ‘Monthly_AverageAllYears’ option is used, </w:t>
       </w:r>
       <w:r>
         <w:t>the user will need to supply monthly data in the input file.  T</w:t>
@@ -4880,7 +4765,6 @@
         <w:ind w:hanging="2250"/>
       </w:pPr>
       <w:bookmarkStart w:id="19" w:name="_Toc173946528"/>
-      <w:proofErr w:type="spellStart"/>
       <w:r>
         <w:t>Monthly_RandomYear</w:t>
       </w:r>
@@ -4888,22 +4772,13 @@
         <w:t>s</w:t>
       </w:r>
       <w:bookmarkEnd w:id="19"/>
-      <w:proofErr w:type="spellEnd"/>
     </w:p>
     <w:p>
       <w:pPr>
         <w:pStyle w:val="textbody"/>
       </w:pPr>
       <w:r>
-        <w:t>If the ‘</w:t>
-      </w:r>
-      <w:proofErr w:type="spellStart"/>
-      <w:r>
-        <w:t>Monthly_RandomYear</w:t>
-      </w:r>
-      <w:proofErr w:type="spellEnd"/>
-      <w:r>
-        <w:t xml:space="preserve">’ option is used, </w:t>
+        <w:t xml:space="preserve">If the ‘Monthly_RandomYear’ option is used, </w:t>
       </w:r>
       <w:r>
         <w:t xml:space="preserve">the user will need to supply monthly data in the input file.  </w:t>
@@ -4951,28 +4826,18 @@
         <w:ind w:hanging="2250"/>
       </w:pPr>
       <w:bookmarkStart w:id="20" w:name="_Toc173946529"/>
-      <w:proofErr w:type="spellStart"/>
       <w:r>
         <w:lastRenderedPageBreak/>
         <w:t>Monthly_SequencedYears</w:t>
       </w:r>
       <w:bookmarkEnd w:id="20"/>
-      <w:proofErr w:type="spellEnd"/>
     </w:p>
     <w:p>
       <w:pPr>
         <w:pStyle w:val="textbody"/>
       </w:pPr>
       <w:r>
-        <w:t>If the ‘</w:t>
-      </w:r>
-      <w:proofErr w:type="spellStart"/>
-      <w:r>
-        <w:t>Monthly_SequencedYears</w:t>
-      </w:r>
-      <w:proofErr w:type="spellEnd"/>
-      <w:r>
-        <w:t xml:space="preserve">’ option is used, </w:t>
+        <w:t xml:space="preserve">If the ‘Monthly_SequencedYears’ option is used, </w:t>
       </w:r>
       <w:r>
         <w:t xml:space="preserve">the user will need to supply monthly data in the input file.  </w:t>
@@ -5089,12 +4954,10 @@
         <w:ind w:hanging="2250"/>
       </w:pPr>
       <w:bookmarkStart w:id="21" w:name="_Toc173946530"/>
-      <w:proofErr w:type="spellStart"/>
       <w:r>
         <w:t>Daily_AverageAllYears</w:t>
       </w:r>
       <w:bookmarkEnd w:id="21"/>
-      <w:proofErr w:type="spellEnd"/>
     </w:p>
     <w:p>
       <w:pPr>
@@ -5104,15 +4967,7 @@
         </w:rPr>
       </w:pPr>
       <w:r>
-        <w:t>If the ‘</w:t>
-      </w:r>
-      <w:proofErr w:type="spellStart"/>
-      <w:r>
-        <w:t>Daily_AverageAllYears</w:t>
-      </w:r>
-      <w:proofErr w:type="spellEnd"/>
-      <w:r>
-        <w:t xml:space="preserve">’ option is used, the user will need to supply daily data in the input file.  </w:t>
+        <w:t xml:space="preserve">If the ‘Daily_AverageAllYears’ option is used, the user will need to supply daily data in the input file.  </w:t>
       </w:r>
       <w:r>
         <w:rPr>
@@ -5222,7 +5077,6 @@
         <w:ind w:hanging="2250"/>
       </w:pPr>
       <w:bookmarkStart w:id="22" w:name="_Toc173946531"/>
-      <w:proofErr w:type="spellStart"/>
       <w:r>
         <w:t>Daily_RandomYear</w:t>
       </w:r>
@@ -5230,7 +5084,6 @@
         <w:t>s</w:t>
       </w:r>
       <w:bookmarkEnd w:id="22"/>
-      <w:proofErr w:type="spellEnd"/>
     </w:p>
     <w:p>
       <w:pPr>
@@ -5241,16 +5094,11 @@
       </w:r>
       <w:r>
         <w:tab/>
-        <w:t>‘</w:t>
-      </w:r>
-      <w:proofErr w:type="spellStart"/>
-      <w:r>
-        <w:t>Daily_RandomYear</w:t>
+        <w:t>‘Daily_RandomYear</w:t>
       </w:r>
       <w:r>
         <w:t>s</w:t>
       </w:r>
-      <w:proofErr w:type="spellEnd"/>
       <w:r>
         <w:t xml:space="preserve">’ option is used, the user will need to supply daily data in the input file.  </w:t>
       </w:r>
@@ -5294,16 +5142,11 @@
         <w:t xml:space="preserve"> </w:t>
       </w:r>
       <w:r>
-        <w:t xml:space="preserve">(see </w:t>
-      </w:r>
-      <w:proofErr w:type="spellStart"/>
-      <w:r>
-        <w:t>Monthly_RandomYear</w:t>
+        <w:t>(see Monthly_RandomYear</w:t>
       </w:r>
       <w:r>
         <w:t>s</w:t>
       </w:r>
-      <w:proofErr w:type="spellEnd"/>
       <w:r>
         <w:t xml:space="preserve"> for more details).</w:t>
       </w:r>
@@ -5317,28 +5160,18 @@
         <w:ind w:hanging="2250"/>
       </w:pPr>
       <w:bookmarkStart w:id="23" w:name="_Toc173946532"/>
-      <w:proofErr w:type="spellStart"/>
       <w:r>
         <w:lastRenderedPageBreak/>
         <w:t>Daily_SequencedYears</w:t>
       </w:r>
       <w:bookmarkEnd w:id="23"/>
-      <w:proofErr w:type="spellEnd"/>
     </w:p>
     <w:p>
       <w:pPr>
         <w:pStyle w:val="textbody"/>
       </w:pPr>
       <w:r>
-        <w:t>If the ‘</w:t>
-      </w:r>
-      <w:proofErr w:type="spellStart"/>
-      <w:r>
-        <w:t>Daily_SequencedYears</w:t>
-      </w:r>
-      <w:proofErr w:type="spellEnd"/>
-      <w:r>
-        <w:t xml:space="preserve">’ option is used, the user will need to supply daily data in the input file.  </w:t>
+        <w:t xml:space="preserve">If the ‘Daily_SequencedYears’ option is used, the user will need to supply daily data in the input file.  </w:t>
       </w:r>
       <w:r>
         <w:t xml:space="preserve">The years in the input file will correspond exactly to the dates specified for the LANDIS simulation, and </w:t>
@@ -5350,15 +5183,7 @@
         <w:t>must appear in chronological order</w:t>
       </w:r>
       <w:r>
-        <w:t xml:space="preserve"> (see </w:t>
-      </w:r>
-      <w:proofErr w:type="spellStart"/>
-      <w:r>
-        <w:t>Monthly_SequencedYears</w:t>
-      </w:r>
-      <w:proofErr w:type="spellEnd"/>
-      <w:r>
-        <w:t xml:space="preserve"> for more details).</w:t>
+        <w:t xml:space="preserve"> (see Monthly_SequencedYears for more details).</w:t>
       </w:r>
       <w:r>
         <w:t xml:space="preserve">  </w:t>
@@ -5412,12 +5237,10 @@
         <w:ind w:left="1170" w:hanging="1170"/>
       </w:pPr>
       <w:bookmarkStart w:id="24" w:name="_Toc173946533"/>
-      <w:proofErr w:type="spellStart"/>
       <w:r>
         <w:t>ClimateFile</w:t>
       </w:r>
       <w:bookmarkEnd w:id="24"/>
-      <w:proofErr w:type="spellEnd"/>
     </w:p>
     <w:p>
       <w:pPr>
@@ -5436,28 +5259,45 @@
         <w:t xml:space="preserve"> the file tha</w:t>
       </w:r>
       <w:r>
-        <w:t>t contains all the climate data.   Minimum temperature, maximum temperature</w:t>
-      </w:r>
-      <w:r>
+        <w:t xml:space="preserve">t contains all the climate data.   </w:t>
+      </w:r>
+      <w:r>
+        <w:rPr>
+          <w:b/>
+          <w:bCs/>
+        </w:rPr>
+        <w:t>Minimum temperature, maximum temperature</w:t>
+      </w:r>
+      <w:r>
+        <w:rPr>
+          <w:b/>
+          <w:bCs/>
+        </w:rPr>
         <w:t xml:space="preserve">, </w:t>
       </w:r>
       <w:r>
+        <w:rPr>
+          <w:b/>
+          <w:bCs/>
+        </w:rPr>
         <w:t>and precipitation</w:t>
       </w:r>
       <w:r>
+        <w:rPr>
+          <w:b/>
+          <w:bCs/>
+        </w:rPr>
         <w:t xml:space="preserve"> </w:t>
       </w:r>
       <w:r>
-        <w:t xml:space="preserve">are </w:t>
-      </w:r>
-      <w:r>
         <w:rPr>
           <w:b/>
-        </w:rPr>
-        <w:t>required</w:t>
-      </w:r>
-      <w:r>
-        <w:t xml:space="preserve"> by the climate library.  </w:t>
+          <w:bCs/>
+        </w:rPr>
+        <w:t>are required by the climate library</w:t>
+      </w:r>
+      <w:r>
+        <w:t xml:space="preserve">.  </w:t>
       </w:r>
       <w:r>
         <w:rPr>
@@ -5495,43 +5335,24 @@
         <w:pStyle w:val="textbody"/>
       </w:pPr>
       <w:r>
-        <w:t xml:space="preserve">Other parameters are </w:t>
-      </w:r>
-      <w:r>
         <w:rPr>
           <w:b/>
-        </w:rPr>
-        <w:t>optional</w:t>
+          <w:bCs/>
+        </w:rPr>
+        <w:t>All o</w:t>
+      </w:r>
+      <w:r>
+        <w:rPr>
+          <w:b/>
+          <w:bCs/>
+        </w:rPr>
+        <w:t>ther parameters are optional</w:t>
       </w:r>
       <w:r>
         <w:t xml:space="preserve"> and include </w:t>
       </w:r>
       <w:r>
-        <w:t>PAR (photosynthetically active radiation), CO</w:t>
-      </w:r>
-      <w:r>
-        <w:rPr>
-          <w:vertAlign w:val="subscript"/>
-        </w:rPr>
-        <w:t>2</w:t>
-      </w:r>
-      <w:r>
-        <w:t xml:space="preserve"> concentration, ozone concentration, </w:t>
-      </w:r>
-      <w:r>
-        <w:t>wind speed, wind direction</w:t>
-      </w:r>
-      <w:r>
-        <w:t>,</w:t>
-      </w:r>
-      <w:r>
-        <w:t xml:space="preserve"> and nitrogen deposition.  </w:t>
-      </w:r>
-      <w:r>
-        <w:t xml:space="preserve">Wind direction must be expressed in terms of degrees where the wind is coming </w:t>
-      </w:r>
-      <w:r>
-        <w:t>from</w:t>
+        <w:t>all the variables listed in Table 1</w:t>
       </w:r>
       <w:r>
         <w:t xml:space="preserve">.  </w:t>
@@ -5554,15 +5375,7 @@
         <w:t xml:space="preserve">.  </w:t>
       </w:r>
       <w:r>
-        <w:t xml:space="preserve">Details about how to configure the </w:t>
-      </w:r>
-      <w:proofErr w:type="spellStart"/>
-      <w:r>
-        <w:t>ClimateFile</w:t>
-      </w:r>
-      <w:proofErr w:type="spellEnd"/>
-      <w:r>
-        <w:t xml:space="preserve"> are described in Chapter 3.</w:t>
+        <w:t>Details about how to configure the ClimateFile are described in Chapter 3.</w:t>
       </w:r>
       <w:r>
         <w:t xml:space="preserve"> </w:t>
@@ -5591,7 +5404,6 @@
         <w:ind w:left="1170" w:hanging="1170"/>
       </w:pPr>
       <w:bookmarkStart w:id="28" w:name="_Toc173946534"/>
-      <w:proofErr w:type="spellStart"/>
       <w:r>
         <w:lastRenderedPageBreak/>
         <w:t>SpinU</w:t>
@@ -5600,7 +5412,6 @@
         <w:t>pClimateTimeSeries</w:t>
       </w:r>
       <w:bookmarkEnd w:id="28"/>
-      <w:proofErr w:type="spellEnd"/>
     </w:p>
     <w:p>
       <w:pPr>
@@ -5622,13 +5433,8 @@
         <w:t>used to specify the options for ‘spin-up’ data, i.e. the climate used during the spin-up phase of the model</w:t>
       </w:r>
       <w:r>
-        <w:t xml:space="preserve">, and the format closely follows that of the </w:t>
-      </w:r>
-      <w:proofErr w:type="spellStart"/>
-      <w:r>
-        <w:t>ClimateTimeSeries</w:t>
-      </w:r>
-      <w:proofErr w:type="spellEnd"/>
+        <w:t>, and the format closely follows that of the ClimateTimeSeries</w:t>
+      </w:r>
       <w:r>
         <w:t xml:space="preserve">.  </w:t>
       </w:r>
@@ -5638,63 +5444,7 @@
         <w:pStyle w:val="textbody"/>
       </w:pPr>
       <w:r>
-        <w:t xml:space="preserve">There are six valid values for the </w:t>
-      </w:r>
-      <w:proofErr w:type="spellStart"/>
-      <w:r>
-        <w:t>ClimateTimeSeries</w:t>
-      </w:r>
-      <w:proofErr w:type="spellEnd"/>
-      <w:r>
-        <w:t xml:space="preserve"> input parameter: </w:t>
-      </w:r>
-      <w:proofErr w:type="spellStart"/>
-      <w:r>
-        <w:t>Monthly_AverageAllYears</w:t>
-      </w:r>
-      <w:proofErr w:type="spellEnd"/>
-      <w:r>
-        <w:t xml:space="preserve">, </w:t>
-      </w:r>
-      <w:proofErr w:type="spellStart"/>
-      <w:r>
-        <w:t>Monthly_RandomYears</w:t>
-      </w:r>
-      <w:proofErr w:type="spellEnd"/>
-      <w:r>
-        <w:t xml:space="preserve">, </w:t>
-      </w:r>
-      <w:proofErr w:type="spellStart"/>
-      <w:r>
-        <w:t>Monthly_SequencedYears</w:t>
-      </w:r>
-      <w:proofErr w:type="spellEnd"/>
-      <w:r>
-        <w:t xml:space="preserve">, </w:t>
-      </w:r>
-      <w:proofErr w:type="spellStart"/>
-      <w:r>
-        <w:t>Daily_AverageAllYears</w:t>
-      </w:r>
-      <w:proofErr w:type="spellEnd"/>
-      <w:r>
-        <w:t xml:space="preserve">, </w:t>
-      </w:r>
-      <w:proofErr w:type="spellStart"/>
-      <w:r>
-        <w:t>Daily_RandomYears</w:t>
-      </w:r>
-      <w:proofErr w:type="spellEnd"/>
-      <w:r>
-        <w:t xml:space="preserve">, and </w:t>
-      </w:r>
-      <w:proofErr w:type="spellStart"/>
-      <w:r>
-        <w:t>Daily_SequencedYears</w:t>
-      </w:r>
-      <w:proofErr w:type="spellEnd"/>
-      <w:r>
-        <w:t xml:space="preserve">.  </w:t>
+        <w:t xml:space="preserve">There are six valid values for the ClimateTimeSeries input parameter: Monthly_AverageAllYears, Monthly_RandomYears, Monthly_SequencedYears, Daily_AverageAllYears, Daily_RandomYears, and Daily_SequencedYears.  </w:t>
       </w:r>
       <w:r>
         <w:t xml:space="preserve">Each one is described </w:t>
@@ -5716,7 +5466,6 @@
         <w:ind w:left="1170" w:hanging="1170"/>
       </w:pPr>
       <w:bookmarkStart w:id="29" w:name="_Toc173946535"/>
-      <w:proofErr w:type="spellStart"/>
       <w:r>
         <w:t>SpinU</w:t>
       </w:r>
@@ -5724,7 +5473,6 @@
         <w:t>pClimateFile</w:t>
       </w:r>
       <w:bookmarkEnd w:id="29"/>
-      <w:proofErr w:type="spellEnd"/>
     </w:p>
     <w:p>
       <w:pPr>
@@ -5737,31 +5485,7 @@
         <w:t xml:space="preserve">specifies </w:t>
       </w:r>
       <w:r>
-        <w:t>the file that contains all the climate data (</w:t>
-      </w:r>
-      <w:proofErr w:type="spellStart"/>
-      <w:r>
-        <w:t>Tmin</w:t>
-      </w:r>
-      <w:proofErr w:type="spellEnd"/>
-      <w:r>
-        <w:t xml:space="preserve">, </w:t>
-      </w:r>
-      <w:proofErr w:type="spellStart"/>
-      <w:r>
-        <w:t>Tmax</w:t>
-      </w:r>
-      <w:proofErr w:type="spellEnd"/>
-      <w:r>
-        <w:t xml:space="preserve"> and Precipitation) for the spin-up phase of the model.    Details about how to configure the </w:t>
-      </w:r>
-      <w:proofErr w:type="spellStart"/>
-      <w:r>
-        <w:t>ClimateFile</w:t>
-      </w:r>
-      <w:proofErr w:type="spellEnd"/>
-      <w:r>
-        <w:t xml:space="preserve"> are described in Chapter 3.</w:t>
+        <w:t>the file that contains all the climate data (Tmin, Tmax and Precipitation) for the spin-up phase of the model.    Details about how to configure the ClimateFile are described in Chapter 3.</w:t>
       </w:r>
     </w:p>
     <w:p>
@@ -5774,12 +5498,10 @@
         <w:ind w:left="1170" w:hanging="1170"/>
       </w:pPr>
       <w:bookmarkStart w:id="30" w:name="_Toc173946536"/>
-      <w:proofErr w:type="spellStart"/>
       <w:r>
         <w:t>GenerateClimateOutputFiles</w:t>
       </w:r>
       <w:bookmarkEnd w:id="30"/>
-      <w:proofErr w:type="spellEnd"/>
     </w:p>
     <w:p>
       <w:pPr>
@@ -5799,12 +5521,10 @@
         <w:ind w:left="1170" w:hanging="1170"/>
       </w:pPr>
       <w:bookmarkStart w:id="31" w:name="_Toc173946537"/>
-      <w:proofErr w:type="spellStart"/>
       <w:r>
         <w:t>UsingFireClimate</w:t>
       </w:r>
       <w:bookmarkEnd w:id="31"/>
-      <w:proofErr w:type="spellEnd"/>
     </w:p>
     <w:p>
       <w:pPr>
@@ -5820,23 +5540,7 @@
         <w:t xml:space="preserve"> parameters are required</w:t>
       </w:r>
       <w:r>
-        <w:t xml:space="preserve"> (</w:t>
-      </w:r>
-      <w:proofErr w:type="spellStart"/>
-      <w:r>
-        <w:t>springstart</w:t>
-      </w:r>
-      <w:proofErr w:type="spellEnd"/>
-      <w:r>
-        <w:t xml:space="preserve"> and </w:t>
-      </w:r>
-      <w:proofErr w:type="spellStart"/>
-      <w:r>
-        <w:t>winterstart</w:t>
-      </w:r>
-      <w:proofErr w:type="spellEnd"/>
-      <w:r>
-        <w:t>)</w:t>
+        <w:t xml:space="preserve"> (springstart and winterstart)</w:t>
       </w:r>
       <w:r>
         <w:t>.</w:t>
@@ -5852,12 +5556,10 @@
         <w:ind w:left="1170" w:hanging="1170"/>
       </w:pPr>
       <w:bookmarkStart w:id="32" w:name="_Toc173946538"/>
-      <w:proofErr w:type="spellStart"/>
       <w:r>
         <w:t>FineFuelMoistureCode</w:t>
       </w:r>
       <w:bookmarkEnd w:id="32"/>
-      <w:proofErr w:type="spellEnd"/>
     </w:p>
     <w:p>
       <w:pPr>
@@ -5877,12 +5579,10 @@
         <w:ind w:left="1170" w:hanging="1170"/>
       </w:pPr>
       <w:bookmarkStart w:id="33" w:name="_Toc173946539"/>
-      <w:proofErr w:type="spellStart"/>
       <w:r>
         <w:t>DuffMoistureCode</w:t>
       </w:r>
       <w:bookmarkEnd w:id="33"/>
-      <w:proofErr w:type="spellEnd"/>
     </w:p>
     <w:p>
       <w:pPr>
@@ -5902,12 +5602,10 @@
         <w:ind w:left="1170" w:hanging="1170"/>
       </w:pPr>
       <w:bookmarkStart w:id="34" w:name="_Toc173946540"/>
-      <w:proofErr w:type="spellStart"/>
       <w:r>
         <w:t>DroughtCode</w:t>
       </w:r>
       <w:bookmarkEnd w:id="34"/>
-      <w:proofErr w:type="spellEnd"/>
     </w:p>
     <w:p>
       <w:pPr>
@@ -5927,13 +5625,11 @@
         <w:ind w:left="1170" w:hanging="1170"/>
       </w:pPr>
       <w:bookmarkStart w:id="35" w:name="_Toc173946541"/>
-      <w:proofErr w:type="spellStart"/>
       <w:r>
         <w:lastRenderedPageBreak/>
         <w:t>FirstDayFire</w:t>
       </w:r>
       <w:bookmarkEnd w:id="35"/>
-      <w:proofErr w:type="spellEnd"/>
     </w:p>
     <w:p>
       <w:pPr>
@@ -5967,12 +5663,10 @@
         <w:ind w:left="1170" w:hanging="1170"/>
       </w:pPr>
       <w:bookmarkStart w:id="36" w:name="_Toc173946542"/>
-      <w:proofErr w:type="spellStart"/>
       <w:r>
         <w:t>LastDayFire</w:t>
       </w:r>
       <w:bookmarkEnd w:id="36"/>
-      <w:proofErr w:type="spellEnd"/>
     </w:p>
     <w:p>
       <w:pPr>
@@ -5993,23 +5687,7 @@
           <w:b/>
           <w:bCs/>
         </w:rPr>
-        <w:t xml:space="preserve">This is also indexed by </w:t>
-      </w:r>
-      <w:proofErr w:type="gramStart"/>
-      <w:r>
-        <w:rPr>
-          <w:b/>
-          <w:bCs/>
-        </w:rPr>
-        <w:t>zero</w:t>
-      </w:r>
-      <w:proofErr w:type="gramEnd"/>
-      <w:r>
-        <w:rPr>
-          <w:b/>
-          <w:bCs/>
-        </w:rPr>
-        <w:t xml:space="preserve"> so the last day of the year is 364. </w:t>
+        <w:t xml:space="preserve">This is also indexed by zero so the last day of the year is 364. </w:t>
       </w:r>
     </w:p>
     <w:p>
@@ -6065,15 +5743,7 @@
         <w:t xml:space="preserve">The user will need to adjust the headers in the climate input file. </w:t>
       </w:r>
       <w:r>
-        <w:t xml:space="preserve">If the data is monthly, the main columns will be Year, Month, and Variable (e.g. variable name, like </w:t>
-      </w:r>
-      <w:proofErr w:type="spellStart"/>
-      <w:r>
-        <w:t>MaxTemp</w:t>
-      </w:r>
-      <w:proofErr w:type="spellEnd"/>
-      <w:r>
-        <w:t xml:space="preserve">. If the data is daily, the main columns will be Year, Month, Day, and Variable. </w:t>
+        <w:t xml:space="preserve">If the data is monthly, the main columns will be Year, Month, and Variable (e.g. variable name, like MaxTemp. If the data is daily, the main columns will be Year, Month, Day, and Variable. </w:t>
       </w:r>
     </w:p>
     <w:p/>
@@ -6133,16 +5803,7 @@
         <w:t>not case sensitive</w:t>
       </w:r>
       <w:r>
-        <w:t xml:space="preserve">.  Wind direction, </w:t>
-      </w:r>
-      <w:r>
-        <w:t xml:space="preserve">wind speed </w:t>
-      </w:r>
-      <w:r>
-        <w:t>and nitrogen deposition data are optional (Table 2)</w:t>
-      </w:r>
-      <w:r>
-        <w:t>.</w:t>
+        <w:t xml:space="preserve">.  </w:t>
       </w:r>
     </w:p>
     <w:p/>
@@ -6173,6 +5834,9 @@
       </w:r>
       <w:r>
         <w:t>.</w:t>
+      </w:r>
+      <w:r>
+        <w:t xml:space="preserve"> Maximum and minimum temperature and precipitation are required in all the succession extensions, but the remaining parameters are optional.</w:t>
       </w:r>
     </w:p>
     <w:p/>
@@ -6340,7 +6004,6 @@
                 <w:szCs w:val="22"/>
               </w:rPr>
             </w:pPr>
-            <w:proofErr w:type="spellStart"/>
             <w:r>
               <w:rPr>
                 <w:rFonts w:ascii="Times New Roman" w:hAnsi="Times New Roman" w:cs="Times New Roman"/>
@@ -6349,7 +6012,6 @@
               </w:rPr>
               <w:t>Tmax</w:t>
             </w:r>
-            <w:proofErr w:type="spellEnd"/>
           </w:p>
         </w:tc>
         <w:tc>
@@ -6364,7 +6026,6 @@
                 <w:szCs w:val="22"/>
               </w:rPr>
             </w:pPr>
-            <w:proofErr w:type="spellStart"/>
             <w:r>
               <w:rPr>
                 <w:rFonts w:ascii="Times New Roman" w:hAnsi="Times New Roman" w:cs="Times New Roman"/>
@@ -6373,7 +6034,6 @@
               </w:rPr>
               <w:t>maxtemp</w:t>
             </w:r>
-            <w:proofErr w:type="spellEnd"/>
           </w:p>
         </w:tc>
       </w:tr>
@@ -6451,7 +6111,6 @@
                 <w:szCs w:val="22"/>
               </w:rPr>
             </w:pPr>
-            <w:proofErr w:type="spellStart"/>
             <w:r>
               <w:rPr>
                 <w:rFonts w:ascii="Times New Roman" w:hAnsi="Times New Roman" w:cs="Times New Roman"/>
@@ -6460,7 +6119,6 @@
               </w:rPr>
               <w:t>Tmin</w:t>
             </w:r>
-            <w:proofErr w:type="spellEnd"/>
           </w:p>
         </w:tc>
         <w:tc>
@@ -6475,7 +6133,6 @@
                 <w:szCs w:val="22"/>
               </w:rPr>
             </w:pPr>
-            <w:proofErr w:type="spellStart"/>
             <w:r>
               <w:rPr>
                 <w:rFonts w:ascii="Times New Roman" w:hAnsi="Times New Roman" w:cs="Times New Roman"/>
@@ -6484,7 +6141,6 @@
               </w:rPr>
               <w:t>mintemp</w:t>
             </w:r>
-            <w:proofErr w:type="spellEnd"/>
           </w:p>
         </w:tc>
       </w:tr>
@@ -6627,7 +6283,6 @@
                 <w:szCs w:val="22"/>
               </w:rPr>
             </w:pPr>
-            <w:proofErr w:type="spellStart"/>
             <w:r>
               <w:rPr>
                 <w:rFonts w:ascii="Times New Roman" w:hAnsi="Times New Roman" w:cs="Times New Roman"/>
@@ -6636,7 +6291,6 @@
               </w:rPr>
               <w:t>precip</w:t>
             </w:r>
-            <w:proofErr w:type="spellEnd"/>
           </w:p>
         </w:tc>
         <w:tc>
@@ -6719,7 +6373,6 @@
                 <w:szCs w:val="22"/>
               </w:rPr>
             </w:pPr>
-            <w:proofErr w:type="spellStart"/>
             <w:r>
               <w:rPr>
                 <w:rFonts w:ascii="Times New Roman" w:hAnsi="Times New Roman" w:cs="Times New Roman"/>
@@ -6728,7 +6381,6 @@
               </w:rPr>
               <w:t>windDirection</w:t>
             </w:r>
-            <w:proofErr w:type="spellEnd"/>
           </w:p>
         </w:tc>
         <w:tc>
@@ -6811,7 +6463,6 @@
                 <w:szCs w:val="22"/>
               </w:rPr>
             </w:pPr>
-            <w:proofErr w:type="spellStart"/>
             <w:r>
               <w:rPr>
                 <w:rFonts w:ascii="Times New Roman" w:hAnsi="Times New Roman" w:cs="Times New Roman"/>
@@ -6820,7 +6471,6 @@
               </w:rPr>
               <w:t>windSpeed</w:t>
             </w:r>
-            <w:proofErr w:type="spellEnd"/>
           </w:p>
         </w:tc>
         <w:tc>
@@ -6887,7 +6537,6 @@
                 <w:szCs w:val="22"/>
               </w:rPr>
             </w:pPr>
-            <w:proofErr w:type="spellStart"/>
             <w:r>
               <w:rPr>
                 <w:rFonts w:ascii="Times New Roman" w:hAnsi="Times New Roman" w:cs="Times New Roman"/>
@@ -6896,7 +6545,6 @@
               </w:rPr>
               <w:t>windNorthing</w:t>
             </w:r>
-            <w:proofErr w:type="spellEnd"/>
           </w:p>
         </w:tc>
         <w:tc>
@@ -6963,7 +6611,6 @@
                 <w:szCs w:val="22"/>
               </w:rPr>
             </w:pPr>
-            <w:proofErr w:type="spellStart"/>
             <w:r>
               <w:rPr>
                 <w:rFonts w:ascii="Times New Roman" w:hAnsi="Times New Roman" w:cs="Times New Roman"/>
@@ -6972,7 +6619,6 @@
               </w:rPr>
               <w:t>windEasting</w:t>
             </w:r>
-            <w:proofErr w:type="spellEnd"/>
           </w:p>
         </w:tc>
         <w:tc>
@@ -7056,7 +6702,6 @@
                 <w:szCs w:val="22"/>
               </w:rPr>
             </w:pPr>
-            <w:proofErr w:type="spellStart"/>
             <w:r>
               <w:rPr>
                 <w:rFonts w:ascii="Times New Roman" w:hAnsi="Times New Roman" w:cs="Times New Roman"/>
@@ -7065,7 +6710,6 @@
               </w:rPr>
               <w:t>Ndeposition</w:t>
             </w:r>
-            <w:proofErr w:type="spellEnd"/>
           </w:p>
         </w:tc>
         <w:tc>
@@ -7080,7 +6724,6 @@
                 <w:szCs w:val="22"/>
               </w:rPr>
             </w:pPr>
-            <w:proofErr w:type="spellStart"/>
             <w:r>
               <w:rPr>
                 <w:rFonts w:ascii="Times New Roman" w:hAnsi="Times New Roman" w:cs="Times New Roman"/>
@@ -7089,7 +6732,6 @@
               </w:rPr>
               <w:t>Ndep</w:t>
             </w:r>
-            <w:proofErr w:type="spellEnd"/>
           </w:p>
         </w:tc>
       </w:tr>
@@ -7150,7 +6792,6 @@
                 <w:szCs w:val="22"/>
               </w:rPr>
             </w:pPr>
-            <w:proofErr w:type="spellStart"/>
             <w:r>
               <w:rPr>
                 <w:rFonts w:ascii="Times New Roman" w:hAnsi="Times New Roman" w:cs="Times New Roman"/>
@@ -7159,7 +6800,6 @@
               </w:rPr>
               <w:t>maxRH</w:t>
             </w:r>
-            <w:proofErr w:type="spellEnd"/>
           </w:p>
         </w:tc>
         <w:tc>
@@ -7234,7 +6874,6 @@
                 <w:szCs w:val="22"/>
               </w:rPr>
             </w:pPr>
-            <w:proofErr w:type="spellStart"/>
             <w:r>
               <w:rPr>
                 <w:rFonts w:ascii="Times New Roman" w:hAnsi="Times New Roman" w:cs="Times New Roman"/>
@@ -7243,7 +6882,6 @@
               </w:rPr>
               <w:t>minRH</w:t>
             </w:r>
-            <w:proofErr w:type="spellEnd"/>
           </w:p>
         </w:tc>
         <w:tc>
@@ -7512,7 +7150,6 @@
                 <w:szCs w:val="22"/>
               </w:rPr>
             </w:pPr>
-            <w:proofErr w:type="spellStart"/>
             <w:r>
               <w:rPr>
                 <w:rFonts w:ascii="Times New Roman" w:hAnsi="Times New Roman" w:cs="Times New Roman"/>
@@ -7521,7 +7158,6 @@
               </w:rPr>
               <w:t>dewpt</w:t>
             </w:r>
-            <w:proofErr w:type="spellEnd"/>
           </w:p>
         </w:tc>
       </w:tr>
@@ -7892,7 +7528,6 @@
                 <w:szCs w:val="22"/>
               </w:rPr>
             </w:pPr>
-            <w:proofErr w:type="spellStart"/>
             <w:r>
               <w:rPr>
                 <w:rFonts w:ascii="Times New Roman" w:hAnsi="Times New Roman" w:cs="Times New Roman"/>
@@ -7901,7 +7536,6 @@
               </w:rPr>
               <w:t>shortwaveRadiation</w:t>
             </w:r>
-            <w:proofErr w:type="spellEnd"/>
           </w:p>
         </w:tc>
       </w:tr>
@@ -8066,6 +7700,7 @@
         </w:rPr>
       </w:pPr>
       <w:r>
+        <w:lastRenderedPageBreak/>
         <w:t xml:space="preserve">This file </w:t>
       </w:r>
       <w:r>
@@ -8090,11 +7725,7 @@
         <w:t xml:space="preserve">ile </w:t>
       </w:r>
       <w:r>
-        <w:t xml:space="preserve">was read in </w:t>
-      </w:r>
-      <w:r>
-        <w:lastRenderedPageBreak/>
-        <w:t>properly</w:t>
+        <w:t>was read in properly</w:t>
       </w:r>
       <w:r>
         <w:t>.</w:t>
@@ -8175,15 +7806,7 @@
     <w:p/>
     <w:p>
       <w:r>
-        <w:t xml:space="preserve">This file is useful for making sure that the </w:t>
-      </w:r>
-      <w:proofErr w:type="spellStart"/>
-      <w:r>
-        <w:t>ClimateFile</w:t>
-      </w:r>
-      <w:proofErr w:type="spellEnd"/>
-      <w:r>
-        <w:t xml:space="preserve"> read in the data properly.</w:t>
+        <w:t>This file is useful for making sure that the ClimateFile read in the data properly.</w:t>
       </w:r>
       <w:r>
         <w:t xml:space="preserve">  For a detailed description of each parameter in Climate-future-input.csv, the user should open up the Future-Input-Log_Metadata.xml file located in the subfolder called Metadata/Climate-Library.</w:t>

</xml_diff>